<commit_message>
Add full Docker installation steps into Word hosting guides
</commit_message>
<xml_diff>
--- a/AWS_Ubuntu_Backend_Hosting_Guide.docx
+++ b/AWS_Ubuntu_Backend_Hosting_Guide.docx
@@ -16,7 +16,7 @@
         </w:rPr>
         <w:t>មគ្គុទ្ទេសក៍ការដាក់ដំណើរការ BACKEND លើ AWS UBUNTU SERVER</w:t>
         <w:br/>
-        <w:t>(Spring Boot 3.4 + PostgreSQL 16 on AWS EC2: 100.56.149.110)</w:t>
+        <w:t>(Spring Boot 3.4 + PostgreSQL 16 on AWS EC2)</w:t>
       </w:r>
     </w:p>
     <w:p>
@@ -31,7 +31,7 @@
           <w:color w:val="006699"/>
           <w:sz w:val="19"/>
         </w:rPr>
-        <w:t>AWS Server IP: 100.56.149.110 | Port: 8080 | Java 21 | Docker Compose</w:t>
+        <w:t>Spring Boot (Port 8080) | PostgreSQL (Port 5432) | Docker Installation Included</w:t>
       </w:r>
     </w:p>
     <w:p>
@@ -101,7 +101,7 @@
                 <w:b/>
                 <w:sz w:val="19"/>
               </w:rPr>
-              <w:t>AWS Server Public IP</w:t>
+              <w:t>Architecture</w:t>
             </w:r>
           </w:p>
         </w:tc>
@@ -125,7 +125,7 @@
                 <w:rFonts w:ascii="Khmer OS Siemreap" w:hAnsi="Khmer OS Siemreap"/>
                 <w:sz w:val="19"/>
               </w:rPr>
-              <w:t>100.56.149.110</w:t>
+              <w:t>Docker Compose Multi-Container Setup</w:t>
             </w:r>
           </w:p>
         </w:tc>
@@ -512,7 +512,7 @@
               </w:rPr>
               <w:t>chmod 400 "C:/path/to/your-key.pem"</w:t>
               <w:br/>
-              <w:t>ssh -i "C:/path/to/your-key.pem" ubuntu@100.56.149.110</w:t>
+              <w:t>ssh -i "C:/path/to/your-key.pem" ubuntu@YOUR_SERVER_IP</w:t>
             </w:r>
           </w:p>
         </w:tc>
@@ -534,7 +534,223 @@
           <w:color w:val="003366"/>
           <w:sz w:val="24"/>
         </w:rPr>
-        <w:t>៣. ការដាក់ដំណើរការ Backend ដោយស្វ័យប្រវត្តិ (1-Command Fast Deploy)</w:t>
+        <w:t>៣. របៀបដំឡើង Docker និង Docker Compose លើ Ubuntu Server</w:t>
+      </w:r>
+    </w:p>
+    <w:p>
+      <w:r>
+        <w:t>ប្រសិនបើ Ubuntu Server របស់អ្នកមិនទាន់មាន Docker សូម Copy &amp; Paste បញ្ជាខាងក្រោមដើម្បីដំឡើង Docker Engine និង Docker Compose ផ្លូវការ (Official Docker Engine)៖</w:t>
+      </w:r>
+    </w:p>
+    <w:p>
+      <w:r>
+        <w:t>ក. ដំឡើង Docker ពេញលេញដោយស្វ័យប្រវត្តិ (Official Script):</w:t>
+      </w:r>
+    </w:p>
+    <w:tbl>
+      <w:tblPr>
+        <w:tblW w:type="auto" w:w="0"/>
+        <w:jc w:val="center"/>
+        <w:tblLayout w:type="fixed"/>
+        <w:tblLook w:firstColumn="1" w:firstRow="1" w:lastColumn="0" w:lastRow="0" w:noHBand="0" w:noVBand="1" w:val="04A0"/>
+      </w:tblPr>
+      <w:tblGrid>
+        <w:gridCol w:w="9360"/>
+      </w:tblGrid>
+      <w:tr>
+        <w:tc>
+          <w:tcPr>
+            <w:tcW w:type="dxa" w:w="9936"/>
+            <w:shd w:fill="F4F6F8"/>
+            <w:tcMar>
+              <w:top w:w="120" w:type="dxa"/>
+              <w:bottom w:w="120" w:type="dxa"/>
+              <w:left w:w="180" w:type="dxa"/>
+              <w:right w:w="180" w:type="dxa"/>
+            </w:tcMar>
+            <w:tcBorders>
+              <w:top w:val="none"/>
+              <w:left w:val="single" w:sz="24" w:space="0" w:color="0052CC"/>
+              <w:bottom w:val="none"/>
+              <w:right w:val="none"/>
+            </w:tcBorders>
+          </w:tcPr>
+          <w:p>
+            <w:pPr>
+              <w:spacing w:before="40" w:after="40" w:line="276" w:lineRule="auto"/>
+            </w:pPr>
+            <w:r>
+              <w:rPr>
+                <w:rFonts w:ascii="Consolas" w:hAnsi="Consolas"/>
+                <w:color w:val="212529"/>
+                <w:sz w:val="19"/>
+              </w:rPr>
+              <w:t># ១. Update Package List &amp; Install Prereqs</w:t>
+              <w:br/>
+              <w:t>sudo apt-get update -y</w:t>
+              <w:br/>
+              <w:t>sudo apt-get install -y ca-certificates curl gnupg lsb-release</w:t>
+              <w:br/>
+              <w:br/>
+              <w:t># ២. បន្ថែម Official Docker GPG Key &amp; Repository</w:t>
+              <w:br/>
+              <w:t>sudo mkdir -p /etc/apt/keyrings</w:t>
+              <w:br/>
+              <w:t>curl -fsSL https://download.docker.com/linux/ubuntu/gpg | sudo gpg --dearmor -o /etc/apt/keyrings/docker.gpg --yes</w:t>
+              <w:br/>
+              <w:t>echo "deb [arch=$(dpkg --print-architecture) signed-by=/etc/apt/keyrings/docker.gpg] https://download.docker.com/linux/ubuntu $(lsb_release -cs) stable" | sudo tee /etc/apt/sources.list.d/docker.list &gt; /dev/null</w:t>
+              <w:br/>
+              <w:br/>
+              <w:t># ៣. ដំឡើង Docker Engine + CLI + Containerd + Docker Compose</w:t>
+              <w:br/>
+              <w:t>sudo apt-get update -y</w:t>
+              <w:br/>
+              <w:t>sudo apt-get install -y docker-ce docker-ce-cli containerd.io docker-buildx-plugin docker-compose-plugin docker-compose</w:t>
+              <w:br/>
+              <w:br/>
+              <w:t># ៤. ផ្ដល់សិទ្ធិឱ្យ User បច្ចុប្បន្នប្រើ Docker ដោយមិនបាច់វាយ sudo</w:t>
+              <w:br/>
+              <w:t>sudo usermod -aG docker $USER</w:t>
+              <w:br/>
+              <w:t>sudo systemctl enable --now docker</w:t>
+              <w:br/>
+              <w:t>newgrp docker</w:t>
+            </w:r>
+          </w:p>
+        </w:tc>
+      </w:tr>
+    </w:tbl>
+    <w:p>
+      <w:pPr>
+        <w:spacing w:after="80"/>
+      </w:pPr>
+    </w:p>
+    <w:p>
+      <w:r>
+        <w:t>ខ. ផ្ទៀងផ្ទាត់ការដំឡើង Docker (Verification):</w:t>
+      </w:r>
+    </w:p>
+    <w:tbl>
+      <w:tblPr>
+        <w:tblW w:type="auto" w:w="0"/>
+        <w:jc w:val="center"/>
+        <w:tblLayout w:type="fixed"/>
+        <w:tblLook w:firstColumn="1" w:firstRow="1" w:lastColumn="0" w:lastRow="0" w:noHBand="0" w:noVBand="1" w:val="04A0"/>
+      </w:tblPr>
+      <w:tblGrid>
+        <w:gridCol w:w="9360"/>
+      </w:tblGrid>
+      <w:tr>
+        <w:tc>
+          <w:tcPr>
+            <w:tcW w:type="dxa" w:w="9936"/>
+            <w:shd w:fill="F4F6F8"/>
+            <w:tcMar>
+              <w:top w:w="120" w:type="dxa"/>
+              <w:bottom w:w="120" w:type="dxa"/>
+              <w:left w:w="180" w:type="dxa"/>
+              <w:right w:w="180" w:type="dxa"/>
+            </w:tcMar>
+            <w:tcBorders>
+              <w:top w:val="none"/>
+              <w:left w:val="single" w:sz="24" w:space="0" w:color="0052CC"/>
+              <w:bottom w:val="none"/>
+              <w:right w:val="none"/>
+            </w:tcBorders>
+          </w:tcPr>
+          <w:p>
+            <w:pPr>
+              <w:spacing w:before="40" w:after="40" w:line="276" w:lineRule="auto"/>
+            </w:pPr>
+            <w:r>
+              <w:rPr>
+                <w:rFonts w:ascii="Consolas" w:hAnsi="Consolas"/>
+                <w:color w:val="212529"/>
+                <w:sz w:val="19"/>
+              </w:rPr>
+              <w:t>docker --version</w:t>
+              <w:br/>
+              <w:t>docker compose version</w:t>
+            </w:r>
+          </w:p>
+        </w:tc>
+      </w:tr>
+    </w:tbl>
+    <w:p>
+      <w:pPr>
+        <w:spacing w:after="80"/>
+      </w:pPr>
+    </w:p>
+    <w:tbl>
+      <w:tblPr>
+        <w:tblW w:type="auto" w:w="0"/>
+        <w:jc w:val="center"/>
+        <w:tblLayout w:type="fixed"/>
+        <w:tblLook w:firstColumn="1" w:firstRow="1" w:lastColumn="0" w:lastRow="0" w:noHBand="0" w:noVBand="1" w:val="04A0"/>
+      </w:tblPr>
+      <w:tblGrid>
+        <w:gridCol w:w="9360"/>
+      </w:tblGrid>
+      <w:tr>
+        <w:tc>
+          <w:tcPr>
+            <w:tcW w:type="dxa" w:w="9936"/>
+            <w:shd w:fill="EAFAF1"/>
+            <w:tcMar>
+              <w:top w:w="100" w:type="dxa"/>
+              <w:bottom w:w="100" w:type="dxa"/>
+              <w:left w:w="150" w:type="dxa"/>
+              <w:right w:w="150" w:type="dxa"/>
+            </w:tcMar>
+            <w:tcBorders>
+              <w:top w:val="none"/>
+              <w:left w:val="single" w:sz="24" w:space="0" w:color="27AE60"/>
+              <w:bottom w:val="none"/>
+              <w:right w:val="none"/>
+            </w:tcBorders>
+          </w:tcPr>
+          <w:p>
+            <w:pPr>
+              <w:spacing w:before="40" w:after="40"/>
+            </w:pPr>
+            <w:r>
+              <w:rPr>
+                <w:rFonts w:ascii="Khmer OS Siemreap" w:hAnsi="Khmer OS Siemreap"/>
+                <w:b/>
+                <w:sz w:val="20"/>
+              </w:rPr>
+              <w:t xml:space="preserve">📌 លទ្ធផលជោគជ័យនៃការដំឡើង: </w:t>
+            </w:r>
+            <w:r>
+              <w:rPr>
+                <w:rFonts w:ascii="Khmer OS Siemreap" w:hAnsi="Khmer OS Siemreap"/>
+                <w:sz w:val="20"/>
+              </w:rPr>
+              <w:t>Docker Version នឹងបង្ហាញ: Docker version 27.x ឬថ្មីជាងនេះ</w:t>
+              <w:br/>
+              <w:t>Docker Compose នឹងបង្ហាញ: Docker Compose version v2.x ឬថ្មីជាងនេះ</w:t>
+            </w:r>
+          </w:p>
+        </w:tc>
+      </w:tr>
+    </w:tbl>
+    <w:p>
+      <w:pPr>
+        <w:spacing w:after="80"/>
+      </w:pPr>
+    </w:p>
+    <w:p>
+      <w:pPr>
+        <w:pStyle w:val="Heading1"/>
+        <w:spacing w:before="200" w:after="120"/>
+      </w:pPr>
+      <w:r>
+        <w:rPr>
+          <w:rFonts w:ascii="Khmer OS Muol Light" w:hAnsi="Khmer OS Muol Light"/>
+          <w:color w:val="003366"/>
+          <w:sz w:val="24"/>
+        </w:rPr>
+        <w:t>៤. ការដាក់ដំណើរការ Backend ដោយស្វ័យប្រវត្តិ (1-Command Fast Deploy)</w:t>
       </w:r>
     </w:p>
     <w:p>
@@ -678,77 +894,12 @@
           <w:color w:val="003366"/>
           <w:sz w:val="24"/>
         </w:rPr>
-        <w:t>៤. វិធីដាក់ដំណើរការដោយដៃ (Manual Step-by-Step Deploy)</w:t>
+        <w:t>៥. វិធីដាក់ដំណើរការដោយដៃ (Manual Step-by-Step Deploy)</w:t>
       </w:r>
     </w:p>
     <w:p>
       <w:r>
-        <w:t>ប្រសិនបើអ្នកចង់បញ្ជាជំហាននីមួយៗដោយខ្លួនឯង សូមអនុវត្តតាមបញ្ជាខាងក្រោម៖</w:t>
-      </w:r>
-    </w:p>
-    <w:p>
-      <w:r>
-        <w:t>ក. ដំឡើង Docker និង Docker Compose លើ Ubuntu Server៖</w:t>
-      </w:r>
-    </w:p>
-    <w:tbl>
-      <w:tblPr>
-        <w:tblW w:type="auto" w:w="0"/>
-        <w:jc w:val="center"/>
-        <w:tblLayout w:type="fixed"/>
-        <w:tblLook w:firstColumn="1" w:firstRow="1" w:lastColumn="0" w:lastRow="0" w:noHBand="0" w:noVBand="1" w:val="04A0"/>
-      </w:tblPr>
-      <w:tblGrid>
-        <w:gridCol w:w="9360"/>
-      </w:tblGrid>
-      <w:tr>
-        <w:tc>
-          <w:tcPr>
-            <w:tcW w:type="dxa" w:w="9936"/>
-            <w:shd w:fill="F4F6F8"/>
-            <w:tcMar>
-              <w:top w:w="120" w:type="dxa"/>
-              <w:bottom w:w="120" w:type="dxa"/>
-              <w:left w:w="180" w:type="dxa"/>
-              <w:right w:w="180" w:type="dxa"/>
-            </w:tcMar>
-            <w:tcBorders>
-              <w:top w:val="none"/>
-              <w:left w:val="single" w:sz="24" w:space="0" w:color="0052CC"/>
-              <w:bottom w:val="none"/>
-              <w:right w:val="none"/>
-            </w:tcBorders>
-          </w:tcPr>
-          <w:p>
-            <w:pPr>
-              <w:spacing w:before="40" w:after="40" w:line="276" w:lineRule="auto"/>
-            </w:pPr>
-            <w:r>
-              <w:rPr>
-                <w:rFonts w:ascii="Consolas" w:hAnsi="Consolas"/>
-                <w:color w:val="212529"/>
-                <w:sz w:val="19"/>
-              </w:rPr>
-              <w:t>sudo apt-get update</w:t>
-              <w:br/>
-              <w:t>sudo apt-get install -y docker.io docker-compose</w:t>
-              <w:br/>
-              <w:t>sudo usermod -aG docker $USER</w:t>
-              <w:br/>
-              <w:t>newgrp docker</w:t>
-            </w:r>
-          </w:p>
-        </w:tc>
-      </w:tr>
-    </w:tbl>
-    <w:p>
-      <w:pPr>
-        <w:spacing w:after="80"/>
-      </w:pPr>
-    </w:p>
-    <w:p>
-      <w:r>
-        <w:t>ខ. បង្កើត និងកំណត់ File .env សម្រាប់ Backend៖</w:t>
+        <w:t>ក. បង្កើត និងកំណត់ File .env សម្រាប់ Backend៖</w:t>
       </w:r>
     </w:p>
     <w:tbl>
@@ -806,7 +957,7 @@
     </w:p>
     <w:p>
       <w:r>
-        <w:t>គ. ចាប់ផ្ដើមដំណើរការ Backend &amp; PostgreSQL ជាមួយ Docker Compose៖</w:t>
+        <w:t>ខ. ចាប់ផ្ដើមដំណើរការ Backend &amp; PostgreSQL ជាមួយ Docker Compose៖</w:t>
       </w:r>
     </w:p>
     <w:tbl>
@@ -876,7 +1027,7 @@
           <w:color w:val="003366"/>
           <w:sz w:val="24"/>
         </w:rPr>
-        <w:t>៥. ការតេស្តសាកល្បង API (Testing &amp; Health Check Endpoints)</w:t>
+        <w:t>៦. ការតេស្តសាកល្បង API (Testing &amp; Health Check Endpoints)</w:t>
       </w:r>
     </w:p>
     <w:p>
@@ -958,7 +1109,7 @@
                 <w:rFonts w:ascii="Consolas" w:hAnsi="Consolas"/>
                 <w:sz w:val="17"/>
               </w:rPr>
-              <w:t>http://100.56.149.110:8080/api/health</w:t>
+              <w:t>http://YOUR_SERVER_IP:8080/api/health</w:t>
             </w:r>
           </w:p>
         </w:tc>
@@ -1025,7 +1176,7 @@
                 <w:rFonts w:ascii="Consolas" w:hAnsi="Consolas"/>
                 <w:sz w:val="17"/>
               </w:rPr>
-              <w:t>http://100.56.149.110:8080/api/kiosk-settings</w:t>
+              <w:t>http://YOUR_SERVER_IP:8080/api/kiosk-settings</w:t>
             </w:r>
           </w:p>
         </w:tc>
@@ -1092,7 +1243,7 @@
                 <w:rFonts w:ascii="Consolas" w:hAnsi="Consolas"/>
                 <w:sz w:val="17"/>
               </w:rPr>
-              <w:t>http://100.56.149.110:8080/api/auth/login</w:t>
+              <w:t>http://YOUR_SERVER_IP:8080/api/auth/login</w:t>
             </w:r>
           </w:p>
         </w:tc>
@@ -1159,7 +1310,7 @@
                 <w:rFonts w:ascii="Consolas" w:hAnsi="Consolas"/>
                 <w:sz w:val="17"/>
               </w:rPr>
-              <w:t>http://100.56.149.110:8080/api/attendance/face-kiosk</w:t>
+              <w:t>http://YOUR_SERVER_IP:8080/api/attendance/face-kiosk</w:t>
             </w:r>
           </w:p>
         </w:tc>
@@ -1220,7 +1371,7 @@
               <w:br/>
               <w:t># តេស្តពីម៉ាស៊ីនខាងក្រៅ (កុំព្យូទ័ររបស់អ្នក)</w:t>
               <w:br/>
-              <w:t>curl -i http://100.56.149.110:8080/api/kiosk-settings</w:t>
+              <w:t>curl -i http://YOUR_SERVER_IP:8080/api/kiosk-settings</w:t>
             </w:r>
           </w:p>
         </w:tc>
@@ -1242,7 +1393,7 @@
           <w:color w:val="003366"/>
           <w:sz w:val="24"/>
         </w:rPr>
-        <w:t>៦. តារាងពាក្យបញ្ជាគ្រប់គ្រង Server សំខាន់ៗ (Useful Commands)</w:t>
+        <w:t>៧. តារាងពាក្យបញ្ជាគ្រប់គ្រង Server សំខាន់ៗ (Useful Commands)</w:t>
       </w:r>
     </w:p>
     <w:tbl>
@@ -1588,7 +1739,7 @@
           <w:color w:val="003366"/>
           <w:sz w:val="24"/>
         </w:rPr>
-        <w:t>៧. ការ Backup និង Restore ទិន្នន័យ Database</w:t>
+        <w:t>៨. ការ Backup និង Restore ទិន្នន័យ Database</w:t>
       </w:r>
     </w:p>
     <w:p>
@@ -1716,7 +1867,7 @@
         </w:rPr>
         <w:t>― ចប់មគ្គុទ្ទេសក៍ការដាក់ដំណើរការ BACKEND លើ AWS UBUNTU ―</w:t>
         <w:br/>
-        <w:t>Server IP: 100.56.149.110 | Spring Boot 3.4.2 + PostgreSQL 16 | HR Chomnan System</w:t>
+        <w:t>Spring Boot 3.4.2 + PostgreSQL 16 | HR Chomnan System</w:t>
       </w:r>
     </w:p>
     <w:sectPr>

</xml_diff>